<commit_message>
feat(auth): add verify email lifecycle and secure logout flow
</commit_message>
<xml_diff>
--- a/docs/branches/feature/feature/feature/2026-dummy/2026-dummy.docx
+++ b/docs/branches/feature/feature/feature/2026-dummy/2026-dummy.docx
@@ -98,8 +98,6 @@
         </w:rPr>
         <w:t xml:space="preserve"> </w:t>
       </w:r>
-      <w:bookmarkStart w:id="0" w:name="_GoBack"/>
-      <w:bookmarkEnd w:id="0"/>
     </w:p>
     <w:p>
       <w:pPr>
@@ -129,7 +127,6 @@
           <w:lang w:eastAsia="en-IN"/>
         </w:rPr>
       </w:pPr>
-      <w:proofErr w:type="spellStart"/>
       <w:r>
         <w:rPr>
           <w:rFonts w:ascii="Courier New" w:eastAsia="Times New Roman" w:hAnsi="Courier New" w:cs="Courier New"/>
@@ -137,29 +134,8 @@
           <w:szCs w:val="20"/>
           <w:lang w:eastAsia="en-IN"/>
         </w:rPr>
-        <w:t>src</w:t>
-      </w:r>
-      <w:proofErr w:type="spellEnd"/>
-      <w:r>
-        <w:rPr>
-          <w:rFonts w:ascii="Courier New" w:eastAsia="Times New Roman" w:hAnsi="Courier New" w:cs="Courier New"/>
-          <w:sz w:val="20"/>
-          <w:szCs w:val="20"/>
-          <w:lang w:eastAsia="en-IN"/>
-        </w:rPr>
-        <w:t>/app/</w:t>
-      </w:r>
-      <w:proofErr w:type="spellStart"/>
-      <w:r>
-        <w:rPr>
-          <w:rFonts w:ascii="Courier New" w:eastAsia="Times New Roman" w:hAnsi="Courier New" w:cs="Courier New"/>
-          <w:sz w:val="20"/>
-          <w:szCs w:val="20"/>
-          <w:lang w:eastAsia="en-IN"/>
-        </w:rPr>
-        <w:t>app.component.ts</w:t>
-      </w:r>
-      <w:proofErr w:type="spellEnd"/>
+        <w:t>src/app/app.component.ts</w:t>
+      </w:r>
     </w:p>
     <w:p>
       <w:pPr>
@@ -202,27 +178,7 @@
           <w:szCs w:val="24"/>
           <w:lang w:eastAsia="en-IN"/>
         </w:rPr>
-        <w:t xml:space="preserve">global app </w:t>
-      </w:r>
-      <w:proofErr w:type="spellStart"/>
-      <w:r>
-        <w:rPr>
-          <w:rFonts w:ascii="Times New Roman" w:eastAsia="Times New Roman" w:hAnsi="Times New Roman" w:cs="Times New Roman"/>
-          <w:sz w:val="24"/>
-          <w:szCs w:val="24"/>
-          <w:lang w:eastAsia="en-IN"/>
-        </w:rPr>
-        <w:t>startup</w:t>
-      </w:r>
-      <w:proofErr w:type="spellEnd"/>
-      <w:r>
-        <w:rPr>
-          <w:rFonts w:ascii="Times New Roman" w:eastAsia="Times New Roman" w:hAnsi="Times New Roman" w:cs="Times New Roman"/>
-          <w:sz w:val="24"/>
-          <w:szCs w:val="24"/>
-          <w:lang w:eastAsia="en-IN"/>
-        </w:rPr>
-        <w:t xml:space="preserve"> </w:t>
+        <w:t xml:space="preserve">global app startup </w:t>
       </w:r>
     </w:p>
     <w:p>
@@ -370,7 +326,6 @@
           <w:lang w:eastAsia="en-IN"/>
         </w:rPr>
       </w:pPr>
-      <w:proofErr w:type="spellStart"/>
       <w:r>
         <w:rPr>
           <w:rFonts w:ascii="Courier New" w:eastAsia="Times New Roman" w:hAnsi="Courier New" w:cs="Courier New"/>
@@ -378,17 +333,7 @@
           <w:szCs w:val="20"/>
           <w:lang w:eastAsia="en-IN"/>
         </w:rPr>
-        <w:t>src</w:t>
-      </w:r>
-      <w:proofErr w:type="spellEnd"/>
-      <w:r>
-        <w:rPr>
-          <w:rFonts w:ascii="Courier New" w:eastAsia="Times New Roman" w:hAnsi="Courier New" w:cs="Courier New"/>
-          <w:sz w:val="20"/>
-          <w:szCs w:val="20"/>
-          <w:lang w:eastAsia="en-IN"/>
-        </w:rPr>
-        <w:t>/app/app.component.html</w:t>
+        <w:t>src/app/app.component.html</w:t>
       </w:r>
     </w:p>
     <w:p>
@@ -580,7 +525,6 @@
           <w:lang w:eastAsia="en-IN"/>
         </w:rPr>
       </w:pPr>
-      <w:proofErr w:type="spellStart"/>
       <w:r>
         <w:rPr>
           <w:rFonts w:ascii="Courier New" w:eastAsia="Times New Roman" w:hAnsi="Courier New" w:cs="Courier New"/>
@@ -588,17 +532,7 @@
           <w:szCs w:val="20"/>
           <w:lang w:eastAsia="en-IN"/>
         </w:rPr>
-        <w:t>src</w:t>
-      </w:r>
-      <w:proofErr w:type="spellEnd"/>
-      <w:r>
-        <w:rPr>
-          <w:rFonts w:ascii="Courier New" w:eastAsia="Times New Roman" w:hAnsi="Courier New" w:cs="Courier New"/>
-          <w:sz w:val="20"/>
-          <w:szCs w:val="20"/>
-          <w:lang w:eastAsia="en-IN"/>
-        </w:rPr>
-        <w:t>/app/app.component.css</w:t>
+        <w:t>src/app/app.component.css</w:t>
       </w:r>
     </w:p>
     <w:p>
@@ -766,7 +700,6 @@
           <w:lang w:eastAsia="en-IN"/>
         </w:rPr>
       </w:pPr>
-      <w:proofErr w:type="spellStart"/>
       <w:r>
         <w:rPr>
           <w:rFonts w:ascii="Courier New" w:eastAsia="Times New Roman" w:hAnsi="Courier New" w:cs="Courier New"/>
@@ -774,29 +707,8 @@
           <w:szCs w:val="20"/>
           <w:lang w:eastAsia="en-IN"/>
         </w:rPr>
-        <w:t>src</w:t>
-      </w:r>
-      <w:proofErr w:type="spellEnd"/>
-      <w:r>
-        <w:rPr>
-          <w:rFonts w:ascii="Courier New" w:eastAsia="Times New Roman" w:hAnsi="Courier New" w:cs="Courier New"/>
-          <w:sz w:val="20"/>
-          <w:szCs w:val="20"/>
-          <w:lang w:eastAsia="en-IN"/>
-        </w:rPr>
-        <w:t>/app/header/</w:t>
-      </w:r>
-      <w:proofErr w:type="spellStart"/>
-      <w:r>
-        <w:rPr>
-          <w:rFonts w:ascii="Courier New" w:eastAsia="Times New Roman" w:hAnsi="Courier New" w:cs="Courier New"/>
-          <w:sz w:val="20"/>
-          <w:szCs w:val="20"/>
-          <w:lang w:eastAsia="en-IN"/>
-        </w:rPr>
-        <w:t>header.component.ts</w:t>
-      </w:r>
-      <w:proofErr w:type="spellEnd"/>
+        <w:t>src/app/header/header.component.ts</w:t>
+      </w:r>
     </w:p>
     <w:p>
       <w:pPr>
@@ -1012,7 +924,6 @@
           <w:lang w:eastAsia="en-IN"/>
         </w:rPr>
       </w:pPr>
-      <w:proofErr w:type="spellStart"/>
       <w:r>
         <w:rPr>
           <w:rFonts w:ascii="Courier New" w:eastAsia="Times New Roman" w:hAnsi="Courier New" w:cs="Courier New"/>
@@ -1020,17 +931,7 @@
           <w:szCs w:val="20"/>
           <w:lang w:eastAsia="en-IN"/>
         </w:rPr>
-        <w:t>src</w:t>
-      </w:r>
-      <w:proofErr w:type="spellEnd"/>
-      <w:r>
-        <w:rPr>
-          <w:rFonts w:ascii="Courier New" w:eastAsia="Times New Roman" w:hAnsi="Courier New" w:cs="Courier New"/>
-          <w:sz w:val="20"/>
-          <w:szCs w:val="20"/>
-          <w:lang w:eastAsia="en-IN"/>
-        </w:rPr>
-        <w:t>/app/header/header.component.html</w:t>
+        <w:t>src/app/header/header.component.html</w:t>
       </w:r>
     </w:p>
     <w:p>
@@ -1222,7 +1123,6 @@
           <w:lang w:eastAsia="en-IN"/>
         </w:rPr>
       </w:pPr>
-      <w:proofErr w:type="spellStart"/>
       <w:r>
         <w:rPr>
           <w:rFonts w:ascii="Courier New" w:eastAsia="Times New Roman" w:hAnsi="Courier New" w:cs="Courier New"/>
@@ -1230,17 +1130,7 @@
           <w:szCs w:val="20"/>
           <w:lang w:eastAsia="en-IN"/>
         </w:rPr>
-        <w:t>src</w:t>
-      </w:r>
-      <w:proofErr w:type="spellEnd"/>
-      <w:r>
-        <w:rPr>
-          <w:rFonts w:ascii="Courier New" w:eastAsia="Times New Roman" w:hAnsi="Courier New" w:cs="Courier New"/>
-          <w:sz w:val="20"/>
-          <w:szCs w:val="20"/>
-          <w:lang w:eastAsia="en-IN"/>
-        </w:rPr>
-        <w:t>/app/header/header.component.css</w:t>
+        <w:t>src/app/header/header.component.css</w:t>
       </w:r>
     </w:p>
     <w:p>
@@ -1432,7 +1322,6 @@
           <w:lang w:eastAsia="en-IN"/>
         </w:rPr>
       </w:pPr>
-      <w:proofErr w:type="spellStart"/>
       <w:r>
         <w:rPr>
           <w:rFonts w:ascii="Courier New" w:eastAsia="Times New Roman" w:hAnsi="Courier New" w:cs="Courier New"/>
@@ -1440,29 +1329,8 @@
           <w:szCs w:val="20"/>
           <w:lang w:eastAsia="en-IN"/>
         </w:rPr>
-        <w:t>src</w:t>
-      </w:r>
-      <w:proofErr w:type="spellEnd"/>
-      <w:r>
-        <w:rPr>
-          <w:rFonts w:ascii="Courier New" w:eastAsia="Times New Roman" w:hAnsi="Courier New" w:cs="Courier New"/>
-          <w:sz w:val="20"/>
-          <w:szCs w:val="20"/>
-          <w:lang w:eastAsia="en-IN"/>
-        </w:rPr>
-        <w:t>/app/services/</w:t>
-      </w:r>
-      <w:proofErr w:type="spellStart"/>
-      <w:r>
-        <w:rPr>
-          <w:rFonts w:ascii="Courier New" w:eastAsia="Times New Roman" w:hAnsi="Courier New" w:cs="Courier New"/>
-          <w:sz w:val="20"/>
-          <w:szCs w:val="20"/>
-          <w:lang w:eastAsia="en-IN"/>
-        </w:rPr>
-        <w:t>authentication.service.ts</w:t>
-      </w:r>
-      <w:proofErr w:type="spellEnd"/>
+        <w:t>src/app/services/authentication.service.ts</w:t>
+      </w:r>
     </w:p>
     <w:p>
       <w:pPr>
@@ -1745,7 +1613,6 @@
           <w:lang w:eastAsia="en-IN"/>
         </w:rPr>
       </w:pPr>
-      <w:proofErr w:type="spellStart"/>
       <w:r>
         <w:rPr>
           <w:rFonts w:ascii="Courier New" w:eastAsia="Times New Roman" w:hAnsi="Courier New" w:cs="Courier New"/>
@@ -1753,29 +1620,8 @@
           <w:szCs w:val="20"/>
           <w:lang w:eastAsia="en-IN"/>
         </w:rPr>
-        <w:t>src</w:t>
-      </w:r>
-      <w:proofErr w:type="spellEnd"/>
-      <w:r>
-        <w:rPr>
-          <w:rFonts w:ascii="Courier New" w:eastAsia="Times New Roman" w:hAnsi="Courier New" w:cs="Courier New"/>
-          <w:sz w:val="20"/>
-          <w:szCs w:val="20"/>
-          <w:lang w:eastAsia="en-IN"/>
-        </w:rPr>
-        <w:t>/app/</w:t>
-      </w:r>
-      <w:proofErr w:type="spellStart"/>
-      <w:r>
-        <w:rPr>
-          <w:rFonts w:ascii="Courier New" w:eastAsia="Times New Roman" w:hAnsi="Courier New" w:cs="Courier New"/>
-          <w:sz w:val="20"/>
-          <w:szCs w:val="20"/>
-          <w:lang w:eastAsia="en-IN"/>
-        </w:rPr>
-        <w:t>app.module.ts</w:t>
-      </w:r>
-      <w:proofErr w:type="spellEnd"/>
+        <w:t>src/app/app.module.ts</w:t>
+      </w:r>
     </w:p>
     <w:p>
       <w:pPr>
@@ -1884,25 +1730,14 @@
           <w:lang w:eastAsia="en-IN"/>
         </w:rPr>
       </w:pPr>
-      <w:proofErr w:type="spellStart"/>
-      <w:r>
-        <w:rPr>
-          <w:rFonts w:ascii="Times New Roman" w:eastAsia="Times New Roman" w:hAnsi="Times New Roman" w:cs="Times New Roman"/>
-          <w:sz w:val="24"/>
-          <w:szCs w:val="24"/>
-          <w:lang w:eastAsia="en-IN"/>
-        </w:rPr>
-        <w:t>HttpClientModule</w:t>
-      </w:r>
-      <w:proofErr w:type="spellEnd"/>
-      <w:r>
-        <w:rPr>
-          <w:rFonts w:ascii="Times New Roman" w:eastAsia="Times New Roman" w:hAnsi="Times New Roman" w:cs="Times New Roman"/>
-          <w:sz w:val="24"/>
-          <w:szCs w:val="24"/>
-          <w:lang w:eastAsia="en-IN"/>
-        </w:rPr>
-        <w:t xml:space="preserve"> </w:t>
+      <w:r>
+        <w:rPr>
+          <w:rFonts w:ascii="Times New Roman" w:eastAsia="Times New Roman" w:hAnsi="Times New Roman" w:cs="Times New Roman"/>
+          <w:sz w:val="24"/>
+          <w:szCs w:val="24"/>
+          <w:lang w:eastAsia="en-IN"/>
+        </w:rPr>
+        <w:t xml:space="preserve">HttpClientModule </w:t>
       </w:r>
     </w:p>
     <w:p>
@@ -2002,7 +1837,6 @@
           <w:lang w:eastAsia="en-IN"/>
         </w:rPr>
       </w:pPr>
-      <w:proofErr w:type="spellStart"/>
       <w:r>
         <w:rPr>
           <w:rFonts w:ascii="Courier New" w:eastAsia="Times New Roman" w:hAnsi="Courier New" w:cs="Courier New"/>
@@ -2010,29 +1844,8 @@
           <w:szCs w:val="20"/>
           <w:lang w:eastAsia="en-IN"/>
         </w:rPr>
-        <w:t>src</w:t>
-      </w:r>
-      <w:proofErr w:type="spellEnd"/>
-      <w:r>
-        <w:rPr>
-          <w:rFonts w:ascii="Courier New" w:eastAsia="Times New Roman" w:hAnsi="Courier New" w:cs="Courier New"/>
-          <w:sz w:val="20"/>
-          <w:szCs w:val="20"/>
-          <w:lang w:eastAsia="en-IN"/>
-        </w:rPr>
-        <w:t>/app/app-</w:t>
-      </w:r>
-      <w:proofErr w:type="spellStart"/>
-      <w:r>
-        <w:rPr>
-          <w:rFonts w:ascii="Courier New" w:eastAsia="Times New Roman" w:hAnsi="Courier New" w:cs="Courier New"/>
-          <w:sz w:val="20"/>
-          <w:szCs w:val="20"/>
-          <w:lang w:eastAsia="en-IN"/>
-        </w:rPr>
-        <w:t>routing.module.ts</w:t>
-      </w:r>
-      <w:proofErr w:type="spellEnd"/>
+        <w:t>src/app/app-routing.module.ts</w:t>
+      </w:r>
     </w:p>
     <w:p>
       <w:pPr>
@@ -2212,7 +2025,6 @@
           <w:lang w:eastAsia="en-IN"/>
         </w:rPr>
       </w:pPr>
-      <w:proofErr w:type="spellStart"/>
       <w:r>
         <w:rPr>
           <w:rFonts w:ascii="Courier New" w:eastAsia="Times New Roman" w:hAnsi="Courier New" w:cs="Courier New"/>
@@ -2220,29 +2032,8 @@
           <w:szCs w:val="20"/>
           <w:lang w:eastAsia="en-IN"/>
         </w:rPr>
-        <w:t>src</w:t>
-      </w:r>
-      <w:proofErr w:type="spellEnd"/>
-      <w:r>
-        <w:rPr>
-          <w:rFonts w:ascii="Courier New" w:eastAsia="Times New Roman" w:hAnsi="Courier New" w:cs="Courier New"/>
-          <w:sz w:val="20"/>
-          <w:szCs w:val="20"/>
-          <w:lang w:eastAsia="en-IN"/>
-        </w:rPr>
-        <w:t>/app/login/</w:t>
-      </w:r>
-      <w:proofErr w:type="spellStart"/>
-      <w:r>
-        <w:rPr>
-          <w:rFonts w:ascii="Courier New" w:eastAsia="Times New Roman" w:hAnsi="Courier New" w:cs="Courier New"/>
-          <w:sz w:val="20"/>
-          <w:szCs w:val="20"/>
-          <w:lang w:eastAsia="en-IN"/>
-        </w:rPr>
-        <w:t>login.component.ts</w:t>
-      </w:r>
-      <w:proofErr w:type="spellEnd"/>
+        <w:t>src/app/login/login.component.ts</w:t>
+      </w:r>
     </w:p>
     <w:p>
       <w:pPr>
@@ -2499,7 +2290,6 @@
           <w:lang w:eastAsia="en-IN"/>
         </w:rPr>
       </w:pPr>
-      <w:proofErr w:type="spellStart"/>
       <w:r>
         <w:rPr>
           <w:rFonts w:ascii="Courier New" w:eastAsia="Times New Roman" w:hAnsi="Courier New" w:cs="Courier New"/>
@@ -2507,17 +2297,7 @@
           <w:szCs w:val="20"/>
           <w:lang w:eastAsia="en-IN"/>
         </w:rPr>
-        <w:t>src</w:t>
-      </w:r>
-      <w:proofErr w:type="spellEnd"/>
-      <w:r>
-        <w:rPr>
-          <w:rFonts w:ascii="Courier New" w:eastAsia="Times New Roman" w:hAnsi="Courier New" w:cs="Courier New"/>
-          <w:sz w:val="20"/>
-          <w:szCs w:val="20"/>
-          <w:lang w:eastAsia="en-IN"/>
-        </w:rPr>
-        <w:t>/app/login/login.component.html</w:t>
+        <w:t>src/app/login/login.component.html</w:t>
       </w:r>
     </w:p>
     <w:p>
@@ -2683,7 +2463,6 @@
           <w:lang w:eastAsia="en-IN"/>
         </w:rPr>
       </w:pPr>
-      <w:proofErr w:type="spellStart"/>
       <w:r>
         <w:rPr>
           <w:rFonts w:ascii="Courier New" w:eastAsia="Times New Roman" w:hAnsi="Courier New" w:cs="Courier New"/>
@@ -2691,29 +2470,8 @@
           <w:szCs w:val="20"/>
           <w:lang w:eastAsia="en-IN"/>
         </w:rPr>
-        <w:t>src</w:t>
-      </w:r>
-      <w:proofErr w:type="spellEnd"/>
-      <w:r>
-        <w:rPr>
-          <w:rFonts w:ascii="Courier New" w:eastAsia="Times New Roman" w:hAnsi="Courier New" w:cs="Courier New"/>
-          <w:sz w:val="20"/>
-          <w:szCs w:val="20"/>
-          <w:lang w:eastAsia="en-IN"/>
-        </w:rPr>
-        <w:t>/app/authentication/</w:t>
-      </w:r>
-      <w:proofErr w:type="spellStart"/>
-      <w:r>
-        <w:rPr>
-          <w:rFonts w:ascii="Courier New" w:eastAsia="Times New Roman" w:hAnsi="Courier New" w:cs="Courier New"/>
-          <w:sz w:val="20"/>
-          <w:szCs w:val="20"/>
-          <w:lang w:eastAsia="en-IN"/>
-        </w:rPr>
-        <w:t>authentication.component.ts</w:t>
-      </w:r>
-      <w:proofErr w:type="spellEnd"/>
+        <w:t>src/app/authentication/authentication.component.ts</w:t>
+      </w:r>
     </w:p>
     <w:p>
       <w:pPr>
@@ -2927,7 +2685,6 @@
           <w:lang w:eastAsia="en-IN"/>
         </w:rPr>
       </w:pPr>
-      <w:proofErr w:type="spellStart"/>
       <w:r>
         <w:rPr>
           <w:rFonts w:ascii="Courier New" w:eastAsia="Times New Roman" w:hAnsi="Courier New" w:cs="Courier New"/>
@@ -2935,17 +2692,7 @@
           <w:szCs w:val="20"/>
           <w:lang w:eastAsia="en-IN"/>
         </w:rPr>
-        <w:t>src</w:t>
-      </w:r>
-      <w:proofErr w:type="spellEnd"/>
-      <w:r>
-        <w:rPr>
-          <w:rFonts w:ascii="Courier New" w:eastAsia="Times New Roman" w:hAnsi="Courier New" w:cs="Courier New"/>
-          <w:sz w:val="20"/>
-          <w:szCs w:val="20"/>
-          <w:lang w:eastAsia="en-IN"/>
-        </w:rPr>
-        <w:t>/app/authentication/authentication.component.html</w:t>
+        <w:t>src/app/authentication/authentication.component.html</w:t>
       </w:r>
     </w:p>
     <w:p>
@@ -3111,7 +2858,6 @@
           <w:lang w:eastAsia="en-IN"/>
         </w:rPr>
       </w:pPr>
-      <w:proofErr w:type="spellStart"/>
       <w:r>
         <w:rPr>
           <w:rFonts w:ascii="Courier New" w:eastAsia="Times New Roman" w:hAnsi="Courier New" w:cs="Courier New"/>
@@ -3119,29 +2865,8 @@
           <w:szCs w:val="20"/>
           <w:lang w:eastAsia="en-IN"/>
         </w:rPr>
-        <w:t>src</w:t>
-      </w:r>
-      <w:proofErr w:type="spellEnd"/>
-      <w:r>
-        <w:rPr>
-          <w:rFonts w:ascii="Courier New" w:eastAsia="Times New Roman" w:hAnsi="Courier New" w:cs="Courier New"/>
-          <w:sz w:val="20"/>
-          <w:szCs w:val="20"/>
-          <w:lang w:eastAsia="en-IN"/>
-        </w:rPr>
-        <w:t>/app/protect-</w:t>
-      </w:r>
-      <w:proofErr w:type="spellStart"/>
-      <w:r>
-        <w:rPr>
-          <w:rFonts w:ascii="Courier New" w:eastAsia="Times New Roman" w:hAnsi="Courier New" w:cs="Courier New"/>
-          <w:sz w:val="20"/>
-          <w:szCs w:val="20"/>
-          <w:lang w:eastAsia="en-IN"/>
-        </w:rPr>
-        <w:t>route.guard.ts</w:t>
-      </w:r>
-      <w:proofErr w:type="spellEnd"/>
+        <w:t>src/app/protect-route.guard.ts</w:t>
+      </w:r>
     </w:p>
     <w:p>
       <w:pPr>
@@ -5027,25 +4752,14 @@
           <w:lang w:eastAsia="en-IN"/>
         </w:rPr>
       </w:pPr>
-      <w:proofErr w:type="spellStart"/>
-      <w:r>
-        <w:rPr>
-          <w:rFonts w:ascii="Times New Roman" w:eastAsia="Times New Roman" w:hAnsi="Times New Roman" w:cs="Times New Roman"/>
-          <w:sz w:val="24"/>
-          <w:szCs w:val="24"/>
-          <w:lang w:eastAsia="en-IN"/>
-        </w:rPr>
-        <w:t>first_name</w:t>
-      </w:r>
-      <w:proofErr w:type="spellEnd"/>
-      <w:r>
-        <w:rPr>
-          <w:rFonts w:ascii="Times New Roman" w:eastAsia="Times New Roman" w:hAnsi="Times New Roman" w:cs="Times New Roman"/>
-          <w:sz w:val="24"/>
-          <w:szCs w:val="24"/>
-          <w:lang w:eastAsia="en-IN"/>
-        </w:rPr>
-        <w:t xml:space="preserve"> </w:t>
+      <w:r>
+        <w:rPr>
+          <w:rFonts w:ascii="Times New Roman" w:eastAsia="Times New Roman" w:hAnsi="Times New Roman" w:cs="Times New Roman"/>
+          <w:sz w:val="24"/>
+          <w:szCs w:val="24"/>
+          <w:lang w:eastAsia="en-IN"/>
+        </w:rPr>
+        <w:t xml:space="preserve">first_name </w:t>
       </w:r>
     </w:p>
     <w:p>
@@ -5062,25 +4776,14 @@
           <w:lang w:eastAsia="en-IN"/>
         </w:rPr>
       </w:pPr>
-      <w:proofErr w:type="spellStart"/>
-      <w:r>
-        <w:rPr>
-          <w:rFonts w:ascii="Times New Roman" w:eastAsia="Times New Roman" w:hAnsi="Times New Roman" w:cs="Times New Roman"/>
-          <w:sz w:val="24"/>
-          <w:szCs w:val="24"/>
-          <w:lang w:eastAsia="en-IN"/>
-        </w:rPr>
-        <w:t>last_name</w:t>
-      </w:r>
-      <w:proofErr w:type="spellEnd"/>
-      <w:r>
-        <w:rPr>
-          <w:rFonts w:ascii="Times New Roman" w:eastAsia="Times New Roman" w:hAnsi="Times New Roman" w:cs="Times New Roman"/>
-          <w:sz w:val="24"/>
-          <w:szCs w:val="24"/>
-          <w:lang w:eastAsia="en-IN"/>
-        </w:rPr>
-        <w:t xml:space="preserve"> </w:t>
+      <w:r>
+        <w:rPr>
+          <w:rFonts w:ascii="Times New Roman" w:eastAsia="Times New Roman" w:hAnsi="Times New Roman" w:cs="Times New Roman"/>
+          <w:sz w:val="24"/>
+          <w:szCs w:val="24"/>
+          <w:lang w:eastAsia="en-IN"/>
+        </w:rPr>
+        <w:t xml:space="preserve">last_name </w:t>
       </w:r>
     </w:p>
     <w:p>
@@ -5606,26 +5309,7 @@
           <w:lang w:eastAsia="en-IN"/>
         </w:rPr>
         <w:br/>
-      </w:r>
-      <w:proofErr w:type="spellStart"/>
-      <w:r>
-        <w:rPr>
-          <w:rFonts w:ascii="Courier New" w:eastAsia="Times New Roman" w:hAnsi="Courier New" w:cs="Courier New"/>
-          <w:sz w:val="20"/>
-          <w:szCs w:val="20"/>
-          <w:lang w:eastAsia="en-IN"/>
-        </w:rPr>
-        <w:t>Supabase</w:t>
-      </w:r>
-      <w:proofErr w:type="spellEnd"/>
-      <w:r>
-        <w:rPr>
-          <w:rFonts w:ascii="Courier New" w:eastAsia="Times New Roman" w:hAnsi="Courier New" w:cs="Courier New"/>
-          <w:sz w:val="20"/>
-          <w:szCs w:val="20"/>
-          <w:lang w:eastAsia="en-IN"/>
-        </w:rPr>
-        <w:t xml:space="preserve"> later</w:t>
+        <w:t>Supabase later</w:t>
       </w:r>
     </w:p>
     <w:p>
@@ -6367,6 +6051,353 @@
     </w:p>
     <w:p/>
     <w:p/>
+    <w:p/>
+    <w:p/>
+    <w:p/>
+    <w:p/>
+    <w:p/>
+    <w:p/>
+    <w:p/>
+    <w:p/>
+    <w:p/>
+    <w:p/>
+    <w:p/>
+    <w:p/>
+    <w:p/>
+    <w:p/>
+    <w:p/>
+    <w:p/>
+    <w:p/>
+    <w:p/>
+    <w:p>
+      <w:pPr>
+        <w:spacing w:before="100" w:beforeAutospacing="1" w:after="100" w:afterAutospacing="1" w:line="240" w:lineRule="auto"/>
+        <w:rPr>
+          <w:rFonts w:ascii="Times New Roman" w:eastAsia="Times New Roman" w:hAnsi="Times New Roman" w:cs="Times New Roman"/>
+          <w:sz w:val="24"/>
+          <w:szCs w:val="24"/>
+          <w:lang w:eastAsia="en-IN"/>
+        </w:rPr>
+      </w:pPr>
+      <w:proofErr w:type="gramStart"/>
+      <w:r>
+        <w:rPr>
+          <w:rFonts w:ascii="Times New Roman" w:eastAsia="Times New Roman" w:hAnsi="Times New Roman" w:cs="Times New Roman"/>
+          <w:sz w:val="24"/>
+          <w:szCs w:val="24"/>
+          <w:lang w:eastAsia="en-IN"/>
+        </w:rPr>
+        <w:lastRenderedPageBreak/>
+        <w:t>YES</w:t>
+      </w:r>
+      <w:proofErr w:type="gramEnd"/>
+      <w:r>
+        <w:rPr>
+          <w:rFonts w:ascii="Times New Roman" w:eastAsia="Times New Roman" w:hAnsi="Times New Roman" w:cs="Times New Roman"/>
+          <w:sz w:val="24"/>
+          <w:szCs w:val="24"/>
+          <w:lang w:eastAsia="en-IN"/>
+        </w:rPr>
+        <w:t xml:space="preserve"> bro </w:t>
+      </w:r>
+      <w:r>
+        <w:rPr>
+          <w:rFonts w:ascii="Segoe UI Emoji" w:eastAsia="Times New Roman" w:hAnsi="Segoe UI Emoji" w:cs="Segoe UI Emoji"/>
+          <w:sz w:val="24"/>
+          <w:szCs w:val="24"/>
+          <w:lang w:eastAsia="en-IN"/>
+        </w:rPr>
+        <w:t>✅🔥</w:t>
+      </w:r>
+      <w:r>
+        <w:rPr>
+          <w:rFonts w:ascii="Times New Roman" w:eastAsia="Times New Roman" w:hAnsi="Times New Roman" w:cs="Times New Roman"/>
+          <w:sz w:val="24"/>
+          <w:szCs w:val="24"/>
+          <w:lang w:eastAsia="en-IN"/>
+        </w:rPr>
+        <w:br/>
+        <w:t>That is the CORRECT real-world auth testing flow.</w:t>
+      </w:r>
+    </w:p>
+    <w:p>
+      <w:pPr>
+        <w:spacing w:before="100" w:beforeAutospacing="1" w:after="100" w:afterAutospacing="1" w:line="240" w:lineRule="auto"/>
+        <w:outlineLvl w:val="0"/>
+        <w:rPr>
+          <w:rFonts w:ascii="Times New Roman" w:eastAsia="Times New Roman" w:hAnsi="Times New Roman" w:cs="Times New Roman"/>
+          <w:b/>
+          <w:bCs/>
+          <w:kern w:val="36"/>
+          <w:sz w:val="48"/>
+          <w:szCs w:val="48"/>
+          <w:lang w:eastAsia="en-IN"/>
+        </w:rPr>
+      </w:pPr>
+      <w:r>
+        <w:rPr>
+          <w:rFonts w:ascii="Segoe UI Emoji" w:eastAsia="Times New Roman" w:hAnsi="Segoe UI Emoji" w:cs="Segoe UI Emoji"/>
+          <w:b/>
+          <w:bCs/>
+          <w:kern w:val="36"/>
+          <w:sz w:val="48"/>
+          <w:szCs w:val="48"/>
+          <w:lang w:eastAsia="en-IN"/>
+        </w:rPr>
+        <w:t>✅</w:t>
+      </w:r>
+      <w:r>
+        <w:rPr>
+          <w:rFonts w:ascii="Times New Roman" w:eastAsia="Times New Roman" w:hAnsi="Times New Roman" w:cs="Times New Roman"/>
+          <w:b/>
+          <w:bCs/>
+          <w:kern w:val="36"/>
+          <w:sz w:val="48"/>
+          <w:szCs w:val="48"/>
+          <w:lang w:eastAsia="en-IN"/>
+        </w:rPr>
+        <w:t xml:space="preserve"> FINAL TEST ORDER</w:t>
+      </w:r>
+    </w:p>
+    <w:p>
+      <w:pPr>
+        <w:tabs>
+          <w:tab w:val="left" w:pos="916"/>
+          <w:tab w:val="left" w:pos="1832"/>
+          <w:tab w:val="left" w:pos="2748"/>
+          <w:tab w:val="left" w:pos="3664"/>
+          <w:tab w:val="left" w:pos="4580"/>
+          <w:tab w:val="left" w:pos="5496"/>
+          <w:tab w:val="left" w:pos="6412"/>
+          <w:tab w:val="left" w:pos="7328"/>
+          <w:tab w:val="left" w:pos="8244"/>
+          <w:tab w:val="left" w:pos="9160"/>
+          <w:tab w:val="left" w:pos="10076"/>
+          <w:tab w:val="left" w:pos="10992"/>
+          <w:tab w:val="left" w:pos="11908"/>
+          <w:tab w:val="left" w:pos="12824"/>
+          <w:tab w:val="left" w:pos="13740"/>
+          <w:tab w:val="left" w:pos="14656"/>
+        </w:tabs>
+        <w:spacing w:after="0" w:line="240" w:lineRule="auto"/>
+        <w:rPr>
+          <w:rFonts w:ascii="Courier New" w:eastAsia="Times New Roman" w:hAnsi="Courier New" w:cs="Courier New"/>
+          <w:sz w:val="20"/>
+          <w:szCs w:val="20"/>
+          <w:lang w:eastAsia="en-IN"/>
+        </w:rPr>
+      </w:pPr>
+      <w:r>
+        <w:rPr>
+          <w:rFonts w:ascii="Courier New" w:eastAsia="Times New Roman" w:hAnsi="Courier New" w:cs="Courier New"/>
+          <w:sz w:val="20"/>
+          <w:szCs w:val="20"/>
+          <w:lang w:eastAsia="en-IN"/>
+        </w:rPr>
+        <w:t>1. Register</w:t>
+      </w:r>
+      <w:r>
+        <w:rPr>
+          <w:rFonts w:ascii="Courier New" w:eastAsia="Times New Roman" w:hAnsi="Courier New" w:cs="Courier New"/>
+          <w:sz w:val="20"/>
+          <w:szCs w:val="20"/>
+          <w:lang w:eastAsia="en-IN"/>
+        </w:rPr>
+        <w:br/>
+        <w:t>2. Verify Email</w:t>
+      </w:r>
+      <w:r>
+        <w:rPr>
+          <w:rFonts w:ascii="Courier New" w:eastAsia="Times New Roman" w:hAnsi="Courier New" w:cs="Courier New"/>
+          <w:sz w:val="20"/>
+          <w:szCs w:val="20"/>
+          <w:lang w:eastAsia="en-IN"/>
+        </w:rPr>
+        <w:br/>
+        <w:t>3. Login</w:t>
+      </w:r>
+      <w:r>
+        <w:rPr>
+          <w:rFonts w:ascii="Courier New" w:eastAsia="Times New Roman" w:hAnsi="Courier New" w:cs="Courier New"/>
+          <w:sz w:val="20"/>
+          <w:szCs w:val="20"/>
+          <w:lang w:eastAsia="en-IN"/>
+        </w:rPr>
+        <w:br/>
+        <w:t>4. Profile</w:t>
+      </w:r>
+      <w:r>
+        <w:rPr>
+          <w:rFonts w:ascii="Courier New" w:eastAsia="Times New Roman" w:hAnsi="Courier New" w:cs="Courier New"/>
+          <w:sz w:val="20"/>
+          <w:szCs w:val="20"/>
+          <w:lang w:eastAsia="en-IN"/>
+        </w:rPr>
+        <w:br/>
+        <w:t>5. Change Password</w:t>
+      </w:r>
+      <w:r>
+        <w:rPr>
+          <w:rFonts w:ascii="Courier New" w:eastAsia="Times New Roman" w:hAnsi="Courier New" w:cs="Courier New"/>
+          <w:sz w:val="20"/>
+          <w:szCs w:val="20"/>
+          <w:lang w:eastAsia="en-IN"/>
+        </w:rPr>
+        <w:br/>
+        <w:t>6. Forgot Password</w:t>
+      </w:r>
+      <w:r>
+        <w:rPr>
+          <w:rFonts w:ascii="Courier New" w:eastAsia="Times New Roman" w:hAnsi="Courier New" w:cs="Courier New"/>
+          <w:sz w:val="20"/>
+          <w:szCs w:val="20"/>
+          <w:lang w:eastAsia="en-IN"/>
+        </w:rPr>
+        <w:br/>
+        <w:t>7. Reset Password</w:t>
+      </w:r>
+      <w:r>
+        <w:rPr>
+          <w:rFonts w:ascii="Courier New" w:eastAsia="Times New Roman" w:hAnsi="Courier New" w:cs="Courier New"/>
+          <w:sz w:val="20"/>
+          <w:szCs w:val="20"/>
+          <w:lang w:eastAsia="en-IN"/>
+        </w:rPr>
+        <w:br/>
+        <w:t>8. Logout</w:t>
+      </w:r>
+    </w:p>
+    <w:p>
+      <w:pPr>
+        <w:spacing w:before="100" w:beforeAutospacing="1" w:after="100" w:afterAutospacing="1" w:line="240" w:lineRule="auto"/>
+        <w:rPr>
+          <w:rFonts w:ascii="Times New Roman" w:eastAsia="Times New Roman" w:hAnsi="Times New Roman" w:cs="Times New Roman"/>
+          <w:sz w:val="24"/>
+          <w:szCs w:val="24"/>
+          <w:lang w:eastAsia="en-IN"/>
+        </w:rPr>
+      </w:pPr>
+      <w:r>
+        <w:rPr>
+          <w:rFonts w:ascii="Times New Roman" w:eastAsia="Times New Roman" w:hAnsi="Times New Roman" w:cs="Times New Roman"/>
+          <w:sz w:val="24"/>
+          <w:szCs w:val="24"/>
+          <w:lang w:eastAsia="en-IN"/>
+        </w:rPr>
+        <w:t xml:space="preserve">NOT directly login first </w:t>
+      </w:r>
+      <w:r>
+        <w:rPr>
+          <w:rFonts w:ascii="Segoe UI Emoji" w:eastAsia="Times New Roman" w:hAnsi="Segoe UI Emoji" w:cs="Segoe UI Emoji"/>
+          <w:sz w:val="24"/>
+          <w:szCs w:val="24"/>
+          <w:lang w:eastAsia="en-IN"/>
+        </w:rPr>
+        <w:t>👍</w:t>
+      </w:r>
+    </w:p>
+    <w:p>
+      <w:pPr>
+        <w:spacing w:before="100" w:beforeAutospacing="1" w:after="100" w:afterAutospacing="1" w:line="240" w:lineRule="auto"/>
+        <w:rPr>
+          <w:rFonts w:ascii="Times New Roman" w:eastAsia="Times New Roman" w:hAnsi="Times New Roman" w:cs="Times New Roman"/>
+          <w:sz w:val="24"/>
+          <w:szCs w:val="24"/>
+          <w:lang w:eastAsia="en-IN"/>
+        </w:rPr>
+      </w:pPr>
+      <w:r>
+        <w:rPr>
+          <w:rFonts w:ascii="Times New Roman" w:eastAsia="Times New Roman" w:hAnsi="Times New Roman" w:cs="Times New Roman"/>
+          <w:sz w:val="24"/>
+          <w:szCs w:val="24"/>
+          <w:lang w:eastAsia="en-IN"/>
+        </w:rPr>
+        <w:t>Because your backend now has:</w:t>
+      </w:r>
+    </w:p>
+    <w:p>
+      <w:pPr>
+        <w:tabs>
+          <w:tab w:val="left" w:pos="916"/>
+          <w:tab w:val="left" w:pos="1832"/>
+          <w:tab w:val="left" w:pos="2748"/>
+          <w:tab w:val="left" w:pos="3664"/>
+          <w:tab w:val="left" w:pos="4580"/>
+          <w:tab w:val="left" w:pos="5496"/>
+          <w:tab w:val="left" w:pos="6412"/>
+          <w:tab w:val="left" w:pos="7328"/>
+          <w:tab w:val="left" w:pos="8244"/>
+          <w:tab w:val="left" w:pos="9160"/>
+          <w:tab w:val="left" w:pos="10076"/>
+          <w:tab w:val="left" w:pos="10992"/>
+          <w:tab w:val="left" w:pos="11908"/>
+          <w:tab w:val="left" w:pos="12824"/>
+          <w:tab w:val="left" w:pos="13740"/>
+          <w:tab w:val="left" w:pos="14656"/>
+        </w:tabs>
+        <w:spacing w:after="0" w:line="240" w:lineRule="auto"/>
+        <w:rPr>
+          <w:rFonts w:ascii="Courier New" w:eastAsia="Times New Roman" w:hAnsi="Courier New" w:cs="Courier New"/>
+          <w:sz w:val="20"/>
+          <w:szCs w:val="20"/>
+          <w:lang w:eastAsia="en-IN"/>
+        </w:rPr>
+      </w:pPr>
+      <w:r>
+        <w:rPr>
+          <w:rFonts w:ascii="Courier New" w:eastAsia="Times New Roman" w:hAnsi="Courier New" w:cs="Courier New"/>
+          <w:sz w:val="20"/>
+          <w:szCs w:val="20"/>
+          <w:lang w:eastAsia="en-IN"/>
+        </w:rPr>
+        <w:t>email verification protection</w:t>
+      </w:r>
+    </w:p>
+    <w:p>
+      <w:pPr>
+        <w:spacing w:before="100" w:beforeAutospacing="1" w:after="100" w:afterAutospacing="1" w:line="240" w:lineRule="auto"/>
+        <w:rPr>
+          <w:rFonts w:ascii="Times New Roman" w:eastAsia="Times New Roman" w:hAnsi="Times New Roman" w:cs="Times New Roman"/>
+          <w:sz w:val="24"/>
+          <w:szCs w:val="24"/>
+          <w:lang w:eastAsia="en-IN"/>
+        </w:rPr>
+      </w:pPr>
+      <w:r>
+        <w:rPr>
+          <w:rFonts w:ascii="Times New Roman" w:eastAsia="Times New Roman" w:hAnsi="Times New Roman" w:cs="Times New Roman"/>
+          <w:sz w:val="24"/>
+          <w:szCs w:val="24"/>
+          <w:lang w:eastAsia="en-IN"/>
+        </w:rPr>
+        <w:t>So unverified users SHOULD fail login.</w:t>
+      </w:r>
+    </w:p>
+    <w:p>
+      <w:pPr>
+        <w:spacing w:before="100" w:beforeAutospacing="1" w:after="100" w:afterAutospacing="1" w:line="240" w:lineRule="auto"/>
+        <w:rPr>
+          <w:rFonts w:ascii="Times New Roman" w:eastAsia="Times New Roman" w:hAnsi="Times New Roman" w:cs="Times New Roman"/>
+          <w:sz w:val="24"/>
+          <w:szCs w:val="24"/>
+          <w:lang w:eastAsia="en-IN"/>
+        </w:rPr>
+      </w:pPr>
+      <w:r>
+        <w:rPr>
+          <w:rFonts w:ascii="Times New Roman" w:eastAsia="Times New Roman" w:hAnsi="Times New Roman" w:cs="Times New Roman"/>
+          <w:sz w:val="24"/>
+          <w:szCs w:val="24"/>
+          <w:lang w:eastAsia="en-IN"/>
+        </w:rPr>
+        <w:t>That is GOOD security architecture.</w:t>
+      </w:r>
+    </w:p>
+    <w:p>
+      <w:bookmarkStart w:id="0" w:name="_GoBack"/>
+      <w:bookmarkEnd w:id="0"/>
+    </w:p>
     <w:sectPr>
       <w:pgSz w:w="11906" w:h="16838"/>
       <w:pgMar w:top="1440" w:right="1440" w:bottom="1440" w:left="1440" w:header="708" w:footer="708" w:gutter="0"/>
@@ -9821,6 +9852,27 @@
     <w:qFormat/>
     <w:rsid w:val="00674006"/>
   </w:style>
+  <w:style w:type="paragraph" w:styleId="Heading1">
+    <w:name w:val="heading 1"/>
+    <w:basedOn w:val="Normal"/>
+    <w:link w:val="Heading1Char"/>
+    <w:uiPriority w:val="9"/>
+    <w:qFormat/>
+    <w:rsid w:val="006D4B2D"/>
+    <w:pPr>
+      <w:spacing w:before="100" w:beforeAutospacing="1" w:after="100" w:afterAutospacing="1" w:line="240" w:lineRule="auto"/>
+      <w:outlineLvl w:val="0"/>
+    </w:pPr>
+    <w:rPr>
+      <w:rFonts w:ascii="Times New Roman" w:eastAsia="Times New Roman" w:hAnsi="Times New Roman" w:cs="Times New Roman"/>
+      <w:b/>
+      <w:bCs/>
+      <w:kern w:val="36"/>
+      <w:sz w:val="48"/>
+      <w:szCs w:val="48"/>
+      <w:lang w:eastAsia="en-IN"/>
+    </w:rPr>
+  </w:style>
   <w:style w:type="character" w:default="1" w:styleId="DefaultParagraphFont">
     <w:name w:val="Default Paragraph Font"/>
     <w:uiPriority w:val="1"/>
@@ -9847,6 +9899,102 @@
     <w:uiPriority w:val="99"/>
     <w:semiHidden/>
     <w:unhideWhenUsed/>
+  </w:style>
+  <w:style w:type="character" w:customStyle="1" w:styleId="Heading1Char">
+    <w:name w:val="Heading 1 Char"/>
+    <w:basedOn w:val="DefaultParagraphFont"/>
+    <w:link w:val="Heading1"/>
+    <w:uiPriority w:val="9"/>
+    <w:rsid w:val="006D4B2D"/>
+    <w:rPr>
+      <w:rFonts w:ascii="Times New Roman" w:eastAsia="Times New Roman" w:hAnsi="Times New Roman" w:cs="Times New Roman"/>
+      <w:b/>
+      <w:bCs/>
+      <w:kern w:val="36"/>
+      <w:sz w:val="48"/>
+      <w:szCs w:val="48"/>
+      <w:lang w:eastAsia="en-IN"/>
+    </w:rPr>
+  </w:style>
+  <w:style w:type="paragraph" w:styleId="NormalWeb">
+    <w:name w:val="Normal (Web)"/>
+    <w:basedOn w:val="Normal"/>
+    <w:uiPriority w:val="99"/>
+    <w:semiHidden/>
+    <w:unhideWhenUsed/>
+    <w:rsid w:val="006D4B2D"/>
+    <w:pPr>
+      <w:spacing w:before="100" w:beforeAutospacing="1" w:after="100" w:afterAutospacing="1" w:line="240" w:lineRule="auto"/>
+    </w:pPr>
+    <w:rPr>
+      <w:rFonts w:ascii="Times New Roman" w:eastAsia="Times New Roman" w:hAnsi="Times New Roman" w:cs="Times New Roman"/>
+      <w:sz w:val="24"/>
+      <w:szCs w:val="24"/>
+      <w:lang w:eastAsia="en-IN"/>
+    </w:rPr>
+  </w:style>
+  <w:style w:type="paragraph" w:styleId="HTMLPreformatted">
+    <w:name w:val="HTML Preformatted"/>
+    <w:basedOn w:val="Normal"/>
+    <w:link w:val="HTMLPreformattedChar"/>
+    <w:uiPriority w:val="99"/>
+    <w:semiHidden/>
+    <w:unhideWhenUsed/>
+    <w:rsid w:val="006D4B2D"/>
+    <w:pPr>
+      <w:tabs>
+        <w:tab w:val="left" w:pos="916"/>
+        <w:tab w:val="left" w:pos="1832"/>
+        <w:tab w:val="left" w:pos="2748"/>
+        <w:tab w:val="left" w:pos="3664"/>
+        <w:tab w:val="left" w:pos="4580"/>
+        <w:tab w:val="left" w:pos="5496"/>
+        <w:tab w:val="left" w:pos="6412"/>
+        <w:tab w:val="left" w:pos="7328"/>
+        <w:tab w:val="left" w:pos="8244"/>
+        <w:tab w:val="left" w:pos="9160"/>
+        <w:tab w:val="left" w:pos="10076"/>
+        <w:tab w:val="left" w:pos="10992"/>
+        <w:tab w:val="left" w:pos="11908"/>
+        <w:tab w:val="left" w:pos="12824"/>
+        <w:tab w:val="left" w:pos="13740"/>
+        <w:tab w:val="left" w:pos="14656"/>
+      </w:tabs>
+      <w:spacing w:after="0" w:line="240" w:lineRule="auto"/>
+    </w:pPr>
+    <w:rPr>
+      <w:rFonts w:ascii="Courier New" w:eastAsia="Times New Roman" w:hAnsi="Courier New" w:cs="Courier New"/>
+      <w:sz w:val="20"/>
+      <w:szCs w:val="20"/>
+      <w:lang w:eastAsia="en-IN"/>
+    </w:rPr>
+  </w:style>
+  <w:style w:type="character" w:customStyle="1" w:styleId="HTMLPreformattedChar">
+    <w:name w:val="HTML Preformatted Char"/>
+    <w:basedOn w:val="DefaultParagraphFont"/>
+    <w:link w:val="HTMLPreformatted"/>
+    <w:uiPriority w:val="99"/>
+    <w:semiHidden/>
+    <w:rsid w:val="006D4B2D"/>
+    <w:rPr>
+      <w:rFonts w:ascii="Courier New" w:eastAsia="Times New Roman" w:hAnsi="Courier New" w:cs="Courier New"/>
+      <w:sz w:val="20"/>
+      <w:szCs w:val="20"/>
+      <w:lang w:eastAsia="en-IN"/>
+    </w:rPr>
+  </w:style>
+  <w:style w:type="character" w:styleId="HTMLCode">
+    <w:name w:val="HTML Code"/>
+    <w:basedOn w:val="DefaultParagraphFont"/>
+    <w:uiPriority w:val="99"/>
+    <w:semiHidden/>
+    <w:unhideWhenUsed/>
+    <w:rsid w:val="006D4B2D"/>
+    <w:rPr>
+      <w:rFonts w:ascii="Courier New" w:eastAsia="Times New Roman" w:hAnsi="Courier New" w:cs="Courier New"/>
+      <w:sz w:val="20"/>
+      <w:szCs w:val="20"/>
+    </w:rPr>
   </w:style>
 </w:styles>
 </file>

</xml_diff>